<commit_message>
update the cartItem and somethings
</commit_message>
<xml_diff>
--- a/docs/Testing/YallaMarket_QA_Testing_Report.docx
+++ b/docs/Testing/YallaMarket_QA_Testing_Report.docx
@@ -574,13 +574,6 @@
     </w:p>
     <w:sdt>
       <w:sdtPr>
-        <w:id w:val="-682905111"/>
-        <w:docPartObj>
-          <w:docPartGallery w:val="Table of Contents"/>
-          <w:docPartUnique/>
-        </w:docPartObj>
-      </w:sdtPr>
-      <w:sdtEndPr>
         <w:rPr>
           <w:rFonts w:ascii="Aptos" w:eastAsia="Aptos" w:hAnsi="Aptos" w:cstheme="minorBidi"/>
           <w:b w:val="0"/>
@@ -589,7 +582,12 @@
           <w:sz w:val="20"/>
           <w:szCs w:val="22"/>
         </w:rPr>
-      </w:sdtEndPr>
+        <w:id w:val="-682905111"/>
+        <w:docPartObj>
+          <w:docPartGallery w:val="Table of Contents"/>
+          <w:docPartUnique/>
+        </w:docPartObj>
+      </w:sdtPr>
       <w:sdtContent>
         <w:p>
           <w:pPr>
@@ -9303,6 +9301,43 @@
           <w:docGrid w:linePitch="360"/>
         </w:sectPr>
       </w:pPr>
+      <w:r>
+        <w:drawing>
+          <wp:inline distT="0" distB="0" distL="0" distR="0" wp14:anchorId="516CD5C0" wp14:editId="04A75DEB">
+            <wp:extent cx="6583680" cy="1006475"/>
+            <wp:effectExtent l="0" t="0" r="7620" b="3175"/>
+            <wp:docPr id="1231021931" name="Picture 1"/>
+            <wp:cNvGraphicFramePr>
+              <a:graphicFrameLocks xmlns:a="http://schemas.openxmlformats.org/drawingml/2006/main" noChangeAspect="1"/>
+            </wp:cNvGraphicFramePr>
+            <a:graphic xmlns:a="http://schemas.openxmlformats.org/drawingml/2006/main">
+              <a:graphicData uri="http://schemas.openxmlformats.org/drawingml/2006/picture">
+                <pic:pic xmlns:pic="http://schemas.openxmlformats.org/drawingml/2006/picture">
+                  <pic:nvPicPr>
+                    <pic:cNvPr id="1231021931" name=""/>
+                    <pic:cNvPicPr/>
+                  </pic:nvPicPr>
+                  <pic:blipFill>
+                    <a:blip r:embed="rId10"/>
+                    <a:stretch>
+                      <a:fillRect/>
+                    </a:stretch>
+                  </pic:blipFill>
+                  <pic:spPr>
+                    <a:xfrm>
+                      <a:off x="0" y="0"/>
+                      <a:ext cx="6583680" cy="1006475"/>
+                    </a:xfrm>
+                    <a:prstGeom prst="rect">
+                      <a:avLst/>
+                    </a:prstGeom>
+                  </pic:spPr>
+                </pic:pic>
+              </a:graphicData>
+            </a:graphic>
+          </wp:inline>
+        </w:drawing>
+      </w:r>
     </w:p>
     <w:p>
       <w:pPr>
@@ -11005,21 +11040,12 @@
       <w:pStyle w:val="Footer"/>
       <w:jc w:val="center"/>
     </w:pPr>
-    <w:proofErr w:type="spellStart"/>
     <w:r>
       <w:rPr>
         <w:color w:val="6B7280"/>
         <w:sz w:val="16"/>
       </w:rPr>
-      <w:t>YallaMarket</w:t>
-    </w:r>
-    <w:proofErr w:type="spellEnd"/>
-    <w:r>
-      <w:rPr>
-        <w:color w:val="6B7280"/>
-        <w:sz w:val="16"/>
-      </w:rPr>
-      <w:t xml:space="preserve"> QA Testing Report | Final Submission Document</w:t>
+      <w:t>YallaMarket QA Testing Report | Final Submission Document</w:t>
     </w:r>
   </w:p>
 </w:ftr>
@@ -11057,23 +11083,13 @@
       <w:pStyle w:val="Header"/>
       <w:jc w:val="right"/>
     </w:pPr>
-    <w:proofErr w:type="spellStart"/>
     <w:r>
       <w:rPr>
         <w:b/>
         <w:color w:val="1F4E79"/>
         <w:sz w:val="18"/>
       </w:rPr>
-      <w:t>YallaMarket</w:t>
-    </w:r>
-    <w:proofErr w:type="spellEnd"/>
-    <w:r>
-      <w:rPr>
-        <w:b/>
-        <w:color w:val="1F4E79"/>
-        <w:sz w:val="18"/>
-      </w:rPr>
-      <w:t xml:space="preserve"> | QA Testing Report</w:t>
+      <w:t>YallaMarket | QA Testing Report</w:t>
     </w:r>
   </w:p>
 </w:hdr>

</xml_diff>